<commit_message>
Complete ForgeAI reference implementation (Java Spring Boot, FastAPI RAG, Next.js web, docs, and CI)
Co-authored-by: Cursor <cursoragent@cursor.com>
</commit_message>
<xml_diff>
--- a/docs/ForgeAI_Engineering_SRS.docx
+++ b/docs/ForgeAI_Engineering_SRS.docx
@@ -7017,7 +7017,7 @@
     </w:p>
     <w:p>
       <w:r>
-        <w:t>2. Node.js owns product workflows, authentication, authorization and final prompt assembly.</w:t>
+        <w:t>2. Java + Spring Boot owns product workflows, authentication, authorization and final prompt assembly.</w:t>
       </w:r>
     </w:p>
     <w:p>
@@ -7075,7 +7075,7 @@
         <w:pStyle w:val="ListBullet"/>
       </w:pPr>
       <w:r>
-        <w:t>Main API: Node.js + TypeScript.</w:t>
+        <w:t>Main API: Java 21 + Spring Boot.</w:t>
       </w:r>
     </w:p>
     <w:p>
@@ -7083,7 +7083,7 @@
         <w:pStyle w:val="ListBullet"/>
       </w:pPr>
       <w:r>
-        <w:t>Worker: separate Node.js process for scheduled/retryable work.</w:t>
+        <w:t>Worker: separate Java Spring Boot process for scheduled/retryable work.</w:t>
       </w:r>
     </w:p>
     <w:p>
@@ -7157,17 +7157,17 @@
     </w:p>
     <w:p>
       <w:r>
-        <w:t>1. Client submits task to Node API.</w:t>
-      </w:r>
-    </w:p>
-    <w:p>
-      <w:r>
-        <w:t>2. Node authenticates session and authorizes project.</w:t>
-      </w:r>
-    </w:p>
-    <w:p>
-      <w:r>
-        <w:t>3. Node obtains approved context and sends scoped retrieval request to FastAPI.</w:t>
+        <w:t>1. Client submits task to Spring Boot API.</w:t>
+      </w:r>
+    </w:p>
+    <w:p>
+      <w:r>
+        <w:t>2. Spring Boot authenticates session and authorizes project.</w:t>
+      </w:r>
+    </w:p>
+    <w:p>
+      <w:r>
+        <w:t>3. Spring Boot obtains approved context and sends scoped retrieval request to FastAPI.</w:t>
       </w:r>
     </w:p>
     <w:p>
@@ -7177,7 +7177,7 @@
     </w:p>
     <w:p>
       <w:r>
-        <w:t>5. Node validates source state and assembles prompt.</w:t>
+        <w:t>5. Spring Boot validates source state and assembles prompt.</w:t>
       </w:r>
     </w:p>
     <w:p>
@@ -7768,7 +7768,7 @@
     </w:p>
     <w:p>
       <w:r>
-        <w:t>"source_reference": "services/worker/ingestion.ts",</w:t>
+        <w:t>"source_reference": "workers/jobs/src/main/java/com/forgeai/worker/JobWorkerScheduler.java",</w:t>
       </w:r>
     </w:p>
     <w:p>
@@ -8458,7 +8458,7 @@
         <w:pStyle w:val="ListBullet"/>
       </w:pPr>
       <w:r>
-        <w:t>Node API and worker: suitable free container hosting; combine temporarily only if job lifecycle/reliability remains sound.</w:t>
+        <w:t>Spring Boot API and Java worker: suitable free container hosting; combine temporarily only if job lifecycle/reliability remains sound.</w:t>
       </w:r>
     </w:p>
     <w:p>
@@ -8866,7 +8866,7 @@
     </w:p>
     <w:p>
       <w:r>
-        <w:t>Unit tests for business logic and prompt assembly; integration tests for PostgreSQL/Redis/Qdrant; contract tests for Node/FastAPI; end-to-end workflows; security tests; RAG evaluations; lifecycle and restore drills.</w:t>
+        <w:t>Unit tests for business logic and prompt assembly; integration tests for PostgreSQL/Redis/Qdrant; contract tests for Spring Boot/FastAPI; end-to-end workflows; security tests; RAG evaluations; lifecycle and restore drills.</w:t>
       </w:r>
     </w:p>
     <w:p>
@@ -9175,7 +9175,7 @@
         <w:spacing w:line="240" w:lineRule="auto"/>
       </w:pPr>
       <w:r>
-        <w:t>Main backend: Node.js + TypeScript.</w:t>
+        <w:t>Main backend: Java 21 + Spring Boot.</w:t>
       </w:r>
     </w:p>
     <w:p>
@@ -9220,7 +9220,7 @@
         <w:spacing w:line="240" w:lineRule="auto"/>
       </w:pPr>
       <w:r>
-        <w:t>Durable jobs: PostgreSQL-backed queue plus separate Node.js worker.</w:t>
+        <w:t>Durable jobs: PostgreSQL-backed queue plus separate Java Spring Boot worker.</w:t>
       </w:r>
     </w:p>
     <w:p>

</xml_diff>